<commit_message>
Merge local course material updates
</commit_message>
<xml_diff>
--- a/Exercise 01 Solution.docx
+++ b/Exercise 01 Solution.docx
@@ -81,23 +81,7 @@
           <w:rFonts w:cstheme="minorHAnsi"/>
           <w:bCs/>
         </w:rPr>
-        <w:t xml:space="preserve">3. Email me with questions or concerns you haven't </w:t>
-      </w:r>
-      <w:proofErr w:type="gramStart"/>
-      <w:r>
-        <w:rPr>
-          <w:rFonts w:cstheme="minorHAnsi"/>
-          <w:bCs/>
-        </w:rPr>
-        <w:t>had answered</w:t>
-      </w:r>
-      <w:proofErr w:type="gramEnd"/>
-      <w:r>
-        <w:rPr>
-          <w:rFonts w:cstheme="minorHAnsi"/>
-          <w:bCs/>
-        </w:rPr>
-        <w:t xml:space="preserve"> and/or what topics you're most excited to cover.</w:t>
+        <w:t>3. Email me with questions or concerns you haven't had answered and/or what topics you're most excited to cover.</w:t>
       </w:r>
     </w:p>
     <w:p>
@@ -387,129 +371,48 @@
         <w:rPr>
           <w:rFonts w:cstheme="minorHAnsi"/>
         </w:rPr>
-        <w:t xml:space="preserve">To begin to understand </w:t>
-      </w:r>
-      <w:r>
-        <w:rPr>
-          <w:rFonts w:cstheme="minorHAnsi"/>
-        </w:rPr>
-        <w:t xml:space="preserve">why certain customers convert while others don’t, we could start by collecting data such as the fitness classes </w:t>
-      </w:r>
-      <w:proofErr w:type="gramStart"/>
-      <w:r>
-        <w:rPr>
-          <w:rFonts w:cstheme="minorHAnsi"/>
-        </w:rPr>
-        <w:t>each individual</w:t>
-      </w:r>
-      <w:proofErr w:type="gramEnd"/>
-      <w:r>
-        <w:rPr>
-          <w:rFonts w:cstheme="minorHAnsi"/>
-        </w:rPr>
-        <w:t xml:space="preserve"> participated in, the frequency of their trips to the gym, their attendance at events, and their interactions with email and website promotions. We could also seek to better understand the demographics of these customers, such as age, gender, and income.</w:t>
-      </w:r>
-    </w:p>
-    <w:p>
-      <w:pPr>
-        <w:rPr>
-          <w:rFonts w:cstheme="minorHAnsi"/>
-        </w:rPr>
-      </w:pPr>
-    </w:p>
-    <w:p>
-      <w:pPr>
-        <w:rPr>
-          <w:rFonts w:cstheme="minorHAnsi"/>
-        </w:rPr>
-      </w:pPr>
-      <w:r>
-        <w:rPr>
-          <w:rFonts w:cstheme="minorHAnsi"/>
-        </w:rPr>
-        <w:t>With</w:t>
-      </w:r>
-      <w:r>
-        <w:rPr>
-          <w:rFonts w:cstheme="minorHAnsi"/>
-        </w:rPr>
-        <w:t xml:space="preserve"> this data, we could then </w:t>
-      </w:r>
-      <w:r>
-        <w:rPr>
-          <w:rFonts w:cstheme="minorHAnsi"/>
-        </w:rPr>
-        <w:t xml:space="preserve">use statistical modeling </w:t>
-      </w:r>
-      <w:r>
-        <w:rPr>
-          <w:rFonts w:cstheme="minorHAnsi"/>
-        </w:rPr>
-        <w:t xml:space="preserve">to try to predict which customers will sign up for </w:t>
-      </w:r>
-      <w:proofErr w:type="gramStart"/>
-      <w:r>
-        <w:rPr>
-          <w:rFonts w:cstheme="minorHAnsi"/>
-        </w:rPr>
-        <w:t>memberships</w:t>
-      </w:r>
-      <w:proofErr w:type="gramEnd"/>
-      <w:r>
-        <w:rPr>
-          <w:rFonts w:cstheme="minorHAnsi"/>
-        </w:rPr>
-        <w:t>. This would</w:t>
-      </w:r>
-      <w:r>
-        <w:rPr>
-          <w:rFonts w:cstheme="minorHAnsi"/>
-        </w:rPr>
-        <w:t xml:space="preserve"> allow</w:t>
-      </w:r>
-      <w:r>
-        <w:rPr>
-          <w:rFonts w:cstheme="minorHAnsi"/>
-        </w:rPr>
-        <w:t xml:space="preserve"> </w:t>
-      </w:r>
-      <w:r>
-        <w:rPr>
-          <w:rFonts w:cstheme="minorHAnsi"/>
-        </w:rPr>
-        <w:t>the gym to</w:t>
-      </w:r>
-      <w:r>
-        <w:rPr>
-          <w:rFonts w:cstheme="minorHAnsi"/>
-        </w:rPr>
-        <w:t xml:space="preserve"> tailor its marketing strategy to individual customers</w:t>
-      </w:r>
-      <w:r>
-        <w:rPr>
-          <w:rFonts w:cstheme="minorHAnsi"/>
-        </w:rPr>
-        <w:t>, and</w:t>
-      </w:r>
-      <w:r>
-        <w:rPr>
-          <w:rFonts w:cstheme="minorHAnsi"/>
-        </w:rPr>
-        <w:t xml:space="preserve"> to increase the likelihood of customer conversion and retention</w:t>
-      </w:r>
-      <w:r>
-        <w:rPr>
-          <w:rFonts w:cstheme="minorHAnsi"/>
-        </w:rPr>
-        <w:t>.</w:t>
-      </w:r>
-    </w:p>
-    <w:p>
-      <w:pPr>
-        <w:rPr>
-          <w:rFonts w:cstheme="minorHAnsi"/>
-        </w:rPr>
-      </w:pPr>
+        <w:t>To assess the health of Patagonia’s customer base, I could begin by examining whether a key metric, such as customer satisfaction or revenue per customer, varies significantly across customers with different demographic characteristics. These differences could indicate gaps in the quality of service or product offerings that are relevant to different demographic groups.</w:t>
+      </w:r>
+    </w:p>
+    <w:p>
+      <w:pPr>
+        <w:rPr>
+          <w:rFonts w:cstheme="minorHAnsi"/>
+        </w:rPr>
+      </w:pPr>
+    </w:p>
+    <w:p>
+      <w:pPr>
+        <w:rPr>
+          <w:rFonts w:cstheme="minorHAnsi"/>
+        </w:rPr>
+      </w:pPr>
+      <w:r>
+        <w:rPr>
+          <w:rFonts w:cstheme="minorHAnsi"/>
+        </w:rPr>
+        <w:t>Another aspect that would be important to consider is whether key metrics change over time. If we observe significant changes in these metrics, we could compare these to past marketing campaigns and programs that Patagonia has implemented and start to determine whether these were effective. Overall, Patagonia should seek customers that are frequent purchasers and have strong loyalty, so if we observe infrequent purchases and high churn rates, Patagonia should address those problems directly.</w:t>
+      </w:r>
+    </w:p>
+    <w:p>
+      <w:pPr>
+        <w:rPr>
+          <w:rFonts w:cstheme="minorHAnsi"/>
+        </w:rPr>
+      </w:pPr>
+    </w:p>
+    <w:p>
+      <w:pPr>
+        <w:rPr>
+          <w:rFonts w:cstheme="minorHAnsi"/>
+        </w:rPr>
+      </w:pPr>
+      <w:r>
+        <w:rPr>
+          <w:rFonts w:cstheme="minorHAnsi"/>
+        </w:rPr>
+        <w:t>Customer purchase data, surveys on customer experience and satisfaction, and demographic data would be essential for this analysis. A baseline would be to compute some descriptive statistics, and then we could use statistical modeling to uncover the drivers of key metrics.</w:t>
+      </w:r>
     </w:p>
     <w:sectPr>
       <w:pgSz w:w="12240" w:h="15840"/>

</xml_diff>